<commit_message>
Fill known placeholders; keep un-inventable fields as marked
Filled factual/known values: Pembroke ZIP 28372, John Dyson's RIVRTECH contact
email, Jake Jones as RCC athletics/sponsorship-approval contact, document date/
version/status, and Effective Date = date of last signature. Filled sensible,
flagged defaults for the schedule: term Sept 1 2026 - May 31 2027, 12-month max
duration, 10 hrs/week cap. Left student-athlete identity, RCC signatory, phone
numbers, Exhibit B specifics, and NIL fields as yellow fields rather than
fabricate names/contacts. README documents filled vs. still-needed.

Co-Authored-By: Claude Opus 4.8 <noreply@anthropic.com>
Claude-Session: https://claude.ai/code/session_011g185cdSXvg9shChJYA9qH
</commit_message>
<xml_diff>
--- a/rivrtech-rcc-agreement/RIVRTECH_RCC_Approval_Checklist.docx
+++ b/rivrtech-rcc-agreement/RIVRTECH_RCC_Approval_Checklist.docx
@@ -140,9 +140,8 @@
                 <w:b w:val="0"/>
                 <w:i w:val="0"/>
                 <w:sz w:val="20"/>
-                <w:highlight w:val="yellow"/>
               </w:rPr>
-              <w:t>[0.1 – DRAFT]</w:t>
+              <w:t>0.1 — Draft</w:t>
             </w:r>
           </w:p>
         </w:tc>
@@ -183,9 +182,8 @@
                 <w:b w:val="0"/>
                 <w:i w:val="0"/>
                 <w:sz w:val="20"/>
-                <w:highlight w:val="yellow"/>
               </w:rPr>
-              <w:t>[DRAFT DATE]</w:t>
+              <w:t>July 16, 2026</w:t>
             </w:r>
           </w:p>
         </w:tc>
@@ -311,9 +309,8 @@
                 <w:b w:val="0"/>
                 <w:i w:val="0"/>
                 <w:sz w:val="20"/>
-                <w:highlight w:val="yellow"/>
               </w:rPr>
-              <w:t>[DRAFT – PENDING APPROVALS]</w:t>
+              <w:t>Draft — Pending approvals</w:t>
             </w:r>
           </w:p>
         </w:tc>

</xml_diff>